<commit_message>
docs: update README for Week 3 - Missed updated document on initial commit
</commit_message>
<xml_diff>
--- a/3.2 Project - Abstraction, Constructors, & Access Specifiers.docx
+++ b/3.2 Project - Abstraction, Constructors, & Access Specifiers.docx
@@ -327,17 +327,20 @@
       </w:r>
     </w:p>
     <w:p>
-      <w:pPr>
-        <w:rPr>
-          <w:b/>
-          <w:bCs/>
-        </w:rPr>
-      </w:pPr>
-      <w:r>
-        <w:rPr>
-          <w:b/>
-          <w:bCs/>
-        </w:rPr>
+      <w:r>
+        <w:t xml:space="preserve">GitHub Link: </w:t>
+      </w:r>
+      <w:hyperlink r:id="rId9" w:history="1">
+        <w:r>
+          <w:rPr>
+            <w:rStyle w:val="Hyperlink"/>
+          </w:rPr>
+          <w:t>https://github.com/chrcra2226/SDC330L_Rolodex.git</w:t>
+        </w:r>
+      </w:hyperlink>
+    </w:p>
+    <w:p>
+      <w:r>
         <w:br w:type="page"/>
       </w:r>
     </w:p>
@@ -378,6 +381,7 @@
           <w:rFonts w:ascii="Times New Roman" w:eastAsia="Times New Roman" w:hAnsi="Times New Roman" w:cs="Times New Roman"/>
           <w:b/>
           <w:bCs/>
+          <w:noProof/>
         </w:rPr>
         <w:drawing>
           <wp:inline distT="0" distB="0" distL="0" distR="0" wp14:anchorId="073B4DEA" wp14:editId="083AD80F">
@@ -395,7 +399,7 @@
                     <pic:cNvPicPr/>
                   </pic:nvPicPr>
                   <pic:blipFill>
-                    <a:blip r:embed="rId9"/>
+                    <a:blip r:embed="rId10"/>
                     <a:stretch>
                       <a:fillRect/>
                     </a:stretch>
@@ -432,6 +436,7 @@
           <w:rFonts w:ascii="Times New Roman" w:eastAsia="Times New Roman" w:hAnsi="Times New Roman" w:cs="Times New Roman"/>
           <w:b/>
           <w:bCs/>
+          <w:noProof/>
         </w:rPr>
         <w:drawing>
           <wp:inline distT="0" distB="0" distL="0" distR="0" wp14:anchorId="09FD1516" wp14:editId="73E910A7">
@@ -449,7 +454,7 @@
                     <pic:cNvPicPr/>
                   </pic:nvPicPr>
                   <pic:blipFill>
-                    <a:blip r:embed="rId10"/>
+                    <a:blip r:embed="rId11"/>
                     <a:stretch>
                       <a:fillRect/>
                     </a:stretch>
@@ -486,6 +491,7 @@
           <w:rFonts w:ascii="Times New Roman" w:eastAsia="Times New Roman" w:hAnsi="Times New Roman" w:cs="Times New Roman"/>
           <w:b/>
           <w:bCs/>
+          <w:noProof/>
         </w:rPr>
         <w:drawing>
           <wp:inline distT="0" distB="0" distL="0" distR="0" wp14:anchorId="54425DC3" wp14:editId="4AD9E28F">
@@ -503,7 +509,7 @@
                     <pic:cNvPicPr/>
                   </pic:nvPicPr>
                   <pic:blipFill>
-                    <a:blip r:embed="rId11"/>
+                    <a:blip r:embed="rId12"/>
                     <a:stretch>
                       <a:fillRect/>
                     </a:stretch>
@@ -525,7 +531,7 @@
       </w:r>
     </w:p>
     <w:sectPr>
-      <w:headerReference w:type="default" r:id="rId12"/>
+      <w:headerReference w:type="default" r:id="rId13"/>
       <w:pgSz w:w="12240" w:h="15840"/>
       <w:pgMar w:top="1440" w:right="1440" w:bottom="1440" w:left="1440" w:header="708" w:footer="708" w:gutter="0"/>
       <w:cols w:space="720"/>
@@ -1514,6 +1520,18 @@
     <w:uiPriority w:val="99"/>
     <w:rsid w:val="009C5F74"/>
   </w:style>
+  <w:style w:type="character" w:styleId="UnresolvedMention">
+    <w:name w:val="Unresolved Mention"/>
+    <w:basedOn w:val="DefaultParagraphFont"/>
+    <w:uiPriority w:val="99"/>
+    <w:semiHidden/>
+    <w:unhideWhenUsed/>
+    <w:rsid w:val="005B0DAC"/>
+    <w:rPr>
+      <w:color w:val="605E5C"/>
+      <w:shd w:val="clear" w:color="auto" w:fill="E1DFDD"/>
+    </w:rPr>
+  </w:style>
 </w:styles>
 </file>
 

</xml_diff>